<commit_message>
Full implementation of productivity–labour compensation analysis pipeline (firm-side, worker-side, CES integration)
</commit_message>
<xml_diff>
--- a/productivity_labourcompensation_distribution/docs/methodology/Productivity_LabourComp_LabourShare_ULC_Project_Methodology.docx
+++ b/productivity_labourcompensation_distribution/docs/methodology/Productivity_LabourComp_LabourShare_ULC_Project_Methodology.docx
@@ -104,7 +104,19 @@
         <w:rPr>
           <w:rFonts w:ascii="Calibri" w:hAnsi="Calibri" w:cs="Calibri"/>
         </w:rPr>
-        <w:t xml:space="preserve">This document integrates the existing project notes into one coherent framework for analysing the relationship between productivity, labour </w:t>
+        <w:t xml:space="preserve">This document </w:t>
+      </w:r>
+      <w:r>
+        <w:rPr>
+          <w:rFonts w:ascii="Calibri" w:hAnsi="Calibri" w:cs="Calibri"/>
+        </w:rPr>
+        <w:t>consists</w:t>
+      </w:r>
+      <w:r>
+        <w:rPr>
+          <w:rFonts w:ascii="Calibri" w:hAnsi="Calibri" w:cs="Calibri"/>
+        </w:rPr>
+        <w:t xml:space="preserve"> coherent framework for analysing the relationship between productivity, labour </w:t>
       </w:r>
       <w:r>
         <w:rPr>
@@ -429,21 +441,21 @@
         <w:rPr>
           <w:rFonts w:ascii="Calibri" w:hAnsi="Calibri" w:cs="Calibri"/>
         </w:rPr>
+        <w:t>Π = pY − wL − rK</w:t>
+      </w:r>
+    </w:p>
+    <w:p>
+      <w:pPr>
+        <w:spacing w:after="0"/>
+        <w:rPr>
+          <w:rFonts w:ascii="Calibri" w:hAnsi="Calibri" w:cs="Calibri"/>
+        </w:rPr>
+      </w:pPr>
+      <w:r>
+        <w:rPr>
+          <w:rFonts w:ascii="Calibri" w:hAnsi="Calibri" w:cs="Calibri"/>
+        </w:rPr>
         <w:lastRenderedPageBreak/>
-        <w:t>Π = pY − wL − rK</w:t>
-      </w:r>
-    </w:p>
-    <w:p>
-      <w:pPr>
-        <w:spacing w:after="0"/>
-        <w:rPr>
-          <w:rFonts w:ascii="Calibri" w:hAnsi="Calibri" w:cs="Calibri"/>
-        </w:rPr>
-      </w:pPr>
-      <w:r>
-        <w:rPr>
-          <w:rFonts w:ascii="Calibri" w:hAnsi="Calibri" w:cs="Calibri"/>
-        </w:rPr>
         <w:t>The first-order conditions are:</w:t>
       </w:r>
     </w:p>
@@ -837,21 +849,21 @@
         <w:rPr>
           <w:rFonts w:ascii="Calibri" w:hAnsi="Calibri" w:cs="Calibri"/>
         </w:rPr>
+        <w:t>If σ &lt; 1, substitution is more limited and labour share tends to be more stable or to move differently in response to factor-price changes.</w:t>
+      </w:r>
+    </w:p>
+    <w:p>
+      <w:pPr>
+        <w:spacing w:after="0"/>
+        <w:rPr>
+          <w:rFonts w:ascii="Calibri" w:hAnsi="Calibri" w:cs="Calibri"/>
+        </w:rPr>
+      </w:pPr>
+      <w:r>
+        <w:rPr>
+          <w:rFonts w:ascii="Calibri" w:hAnsi="Calibri" w:cs="Calibri"/>
+        </w:rPr>
         <w:lastRenderedPageBreak/>
-        <w:t>If σ &lt; 1, substitution is more limited and labour share tends to be more stable or to move differently in response to factor-price changes.</w:t>
-      </w:r>
-    </w:p>
-    <w:p>
-      <w:pPr>
-        <w:spacing w:after="0"/>
-        <w:rPr>
-          <w:rFonts w:ascii="Calibri" w:hAnsi="Calibri" w:cs="Calibri"/>
-        </w:rPr>
-      </w:pPr>
-      <w:r>
-        <w:rPr>
-          <w:rFonts w:ascii="Calibri" w:hAnsi="Calibri" w:cs="Calibri"/>
-        </w:rPr>
         <w:t>The practical implication is that the Cobb–Douglas module gives a clean benchmark for pass-through, while the CES module provides a theory of why labour shares may drift over time instead of remaining constant. In this project, CES is treated as a linked extension rather than the baseline estimation object.</w:t>
       </w:r>
     </w:p>
@@ -1205,50 +1217,50 @@
           <w:sz w:val="23"/>
           <w:szCs w:val="23"/>
         </w:rPr>
+        <w:t>3.2 Module B: worker-side transmission</w:t>
+      </w:r>
+    </w:p>
+    <w:p>
+      <w:pPr>
+        <w:spacing w:after="0"/>
+        <w:rPr>
+          <w:rFonts w:ascii="Calibri" w:hAnsi="Calibri" w:cs="Calibri"/>
+        </w:rPr>
+      </w:pPr>
+      <w:r>
+        <w:rPr>
+          <w:rFonts w:ascii="Calibri" w:hAnsi="Calibri" w:cs="Calibri"/>
+        </w:rPr>
+        <w:t>The worker-side module uses OECD real wage levels in constant PPP terms. These are already deflated on a consumption-price basis, so they represent purchasing-power wages rather than output-price wages.</w:t>
+      </w:r>
+    </w:p>
+    <w:p>
+      <w:pPr>
+        <w:pStyle w:val="ListBullet"/>
+        <w:spacing w:after="0"/>
+        <w:rPr>
+          <w:rFonts w:ascii="Calibri" w:hAnsi="Calibri" w:cs="Calibri"/>
+        </w:rPr>
+      </w:pPr>
+      <w:r>
+        <w:rPr>
+          <w:rFonts w:ascii="Calibri" w:hAnsi="Calibri" w:cs="Calibri"/>
+        </w:rPr>
+        <w:t>OECD Average annual wages, constant prices, constant PPPs, base year 2021.</w:t>
+      </w:r>
+    </w:p>
+    <w:p>
+      <w:pPr>
+        <w:spacing w:after="0"/>
+        <w:rPr>
+          <w:rFonts w:ascii="Calibri" w:hAnsi="Calibri" w:cs="Calibri"/>
+        </w:rPr>
+      </w:pPr>
+      <w:r>
+        <w:rPr>
+          <w:rFonts w:ascii="Calibri" w:hAnsi="Calibri" w:cs="Calibri"/>
+        </w:rPr>
         <w:lastRenderedPageBreak/>
-        <w:t>3.2 Module B: worker-side transmission</w:t>
-      </w:r>
-    </w:p>
-    <w:p>
-      <w:pPr>
-        <w:spacing w:after="0"/>
-        <w:rPr>
-          <w:rFonts w:ascii="Calibri" w:hAnsi="Calibri" w:cs="Calibri"/>
-        </w:rPr>
-      </w:pPr>
-      <w:r>
-        <w:rPr>
-          <w:rFonts w:ascii="Calibri" w:hAnsi="Calibri" w:cs="Calibri"/>
-        </w:rPr>
-        <w:t>The worker-side module uses OECD real wage levels in constant PPP terms. These are already deflated on a consumption-price basis, so they represent purchasing-power wages rather than output-price wages.</w:t>
-      </w:r>
-    </w:p>
-    <w:p>
-      <w:pPr>
-        <w:pStyle w:val="ListBullet"/>
-        <w:spacing w:after="0"/>
-        <w:rPr>
-          <w:rFonts w:ascii="Calibri" w:hAnsi="Calibri" w:cs="Calibri"/>
-        </w:rPr>
-      </w:pPr>
-      <w:r>
-        <w:rPr>
-          <w:rFonts w:ascii="Calibri" w:hAnsi="Calibri" w:cs="Calibri"/>
-        </w:rPr>
-        <w:t>OECD Average annual wages, constant prices, constant PPPs, base year 2021.</w:t>
-      </w:r>
-    </w:p>
-    <w:p>
-      <w:pPr>
-        <w:spacing w:after="0"/>
-        <w:rPr>
-          <w:rFonts w:ascii="Calibri" w:hAnsi="Calibri" w:cs="Calibri"/>
-        </w:rPr>
-      </w:pPr>
-      <w:r>
-        <w:rPr>
-          <w:rFonts w:ascii="Calibri" w:hAnsi="Calibri" w:cs="Calibri"/>
-        </w:rPr>
         <w:t>This module compares the time profile of worker-side real wages to the time profile of productivity. It answers a different question from the firm-side module: not whether firms pass productivity gains into labour costs, but whether workers see those gains in purchasing-power terms.</w:t>
       </w:r>
     </w:p>
@@ -1634,7 +1646,6 @@
         <w:rPr>
           <w:rFonts w:ascii="Calibri" w:hAnsi="Calibri" w:cs="Calibri"/>
         </w:rPr>
-        <w:lastRenderedPageBreak/>
         <w:t>Use the same start year t0 when building base-100 indices.</w:t>
       </w:r>
     </w:p>
@@ -1681,6 +1692,7 @@
         <w:rPr>
           <w:rFonts w:ascii="Calibri" w:hAnsi="Calibri" w:cs="Calibri"/>
         </w:rPr>
+        <w:lastRenderedPageBreak/>
         <w:t>GVA_real_ph(i,t) = gross value added per hour, chain-linked volume</w:t>
       </w:r>
     </w:p>
@@ -2124,51 +2136,51 @@
         <w:rPr>
           <w:rFonts w:ascii="Calibri" w:hAnsi="Calibri" w:cs="Calibri"/>
         </w:rPr>
+        <w:t>Log level: ln(W_real_cons)</w:t>
+      </w:r>
+    </w:p>
+    <w:p>
+      <w:pPr>
+        <w:pStyle w:val="ListBullet"/>
+        <w:spacing w:after="0"/>
+        <w:rPr>
+          <w:rFonts w:ascii="Calibri" w:hAnsi="Calibri" w:cs="Calibri"/>
+        </w:rPr>
+      </w:pPr>
+      <w:r>
+        <w:rPr>
+          <w:rFonts w:ascii="Calibri" w:hAnsi="Calibri" w:cs="Calibri"/>
+        </w:rPr>
+        <w:t>Annual log growth if needed: g_wcons(i,t) = ln(W_real_cons(i,t)) − ln(W_real_cons(i,t−1))</w:t>
+      </w:r>
+    </w:p>
+    <w:p>
+      <w:pPr>
+        <w:pStyle w:val="ListBullet"/>
+        <w:spacing w:after="0"/>
+        <w:rPr>
+          <w:rFonts w:ascii="Calibri" w:hAnsi="Calibri" w:cs="Calibri"/>
+        </w:rPr>
+      </w:pPr>
+      <w:r>
+        <w:rPr>
+          <w:rFonts w:ascii="Calibri" w:hAnsi="Calibri" w:cs="Calibri"/>
+        </w:rPr>
+        <w:t>Base-100 index: WconsIndex(i,t) = 100 · W_real_cons(i,t) / W_real_cons(i,t0)</w:t>
+      </w:r>
+    </w:p>
+    <w:p>
+      <w:pPr>
+        <w:spacing w:after="0"/>
+        <w:rPr>
+          <w:rFonts w:ascii="Calibri" w:hAnsi="Calibri" w:cs="Calibri"/>
+        </w:rPr>
+      </w:pPr>
+      <w:r>
+        <w:rPr>
+          <w:rFonts w:ascii="Calibri" w:hAnsi="Calibri" w:cs="Calibri"/>
+        </w:rPr>
         <w:lastRenderedPageBreak/>
-        <w:t>Log level: ln(W_real_cons)</w:t>
-      </w:r>
-    </w:p>
-    <w:p>
-      <w:pPr>
-        <w:pStyle w:val="ListBullet"/>
-        <w:spacing w:after="0"/>
-        <w:rPr>
-          <w:rFonts w:ascii="Calibri" w:hAnsi="Calibri" w:cs="Calibri"/>
-        </w:rPr>
-      </w:pPr>
-      <w:r>
-        <w:rPr>
-          <w:rFonts w:ascii="Calibri" w:hAnsi="Calibri" w:cs="Calibri"/>
-        </w:rPr>
-        <w:t>Annual log growth if needed: g_wcons(i,t) = ln(W_real_cons(i,t)) − ln(W_real_cons(i,t−1))</w:t>
-      </w:r>
-    </w:p>
-    <w:p>
-      <w:pPr>
-        <w:pStyle w:val="ListBullet"/>
-        <w:spacing w:after="0"/>
-        <w:rPr>
-          <w:rFonts w:ascii="Calibri" w:hAnsi="Calibri" w:cs="Calibri"/>
-        </w:rPr>
-      </w:pPr>
-      <w:r>
-        <w:rPr>
-          <w:rFonts w:ascii="Calibri" w:hAnsi="Calibri" w:cs="Calibri"/>
-        </w:rPr>
-        <w:t>Base-100 index: WconsIndex(i,t) = 100 · W_real_cons(i,t) / W_real_cons(i,t0)</w:t>
-      </w:r>
-    </w:p>
-    <w:p>
-      <w:pPr>
-        <w:spacing w:after="0"/>
-        <w:rPr>
-          <w:rFonts w:ascii="Calibri" w:hAnsi="Calibri" w:cs="Calibri"/>
-        </w:rPr>
-      </w:pPr>
-      <w:r>
-        <w:rPr>
-          <w:rFonts w:ascii="Calibri" w:hAnsi="Calibri" w:cs="Calibri"/>
-        </w:rPr>
         <w:t>This index is compared with productivity, not with output-price wages. The worker-side question is whether workers see productivity gains in consumption-price terms.</w:t>
       </w:r>
     </w:p>
@@ -2630,35 +2642,35 @@
         <w:rPr>
           <w:rFonts w:ascii="Calibri" w:hAnsi="Calibri" w:cs="Calibri"/>
         </w:rPr>
+        <w:t>β measures the pass-through from productivity to firm-side real labour costs; γ measures the pass-through from productivity to workers’ real purchasing power.</w:t>
+      </w:r>
+    </w:p>
+    <w:p>
+      <w:pPr>
+        <w:spacing w:after="0"/>
+        <w:rPr>
+          <w:rFonts w:ascii="Calibri" w:hAnsi="Calibri" w:cs="Calibri"/>
+        </w:rPr>
+      </w:pPr>
+      <w:r>
+        <w:rPr>
+          <w:rFonts w:ascii="Calibri" w:hAnsi="Calibri" w:cs="Calibri"/>
+        </w:rPr>
+        <w:t>If you want a labour-share-augmented specification that mirrors the theoretical identity, you can also estimate descriptive decompositions such as:</w:t>
+      </w:r>
+    </w:p>
+    <w:p>
+      <w:pPr>
+        <w:spacing w:after="0"/>
+        <w:rPr>
+          <w:rFonts w:ascii="Calibri" w:hAnsi="Calibri" w:cs="Calibri"/>
+        </w:rPr>
+      </w:pPr>
+      <w:r>
+        <w:rPr>
+          <w:rFonts w:ascii="Calibri" w:hAnsi="Calibri" w:cs="Calibri"/>
+        </w:rPr>
         <w:lastRenderedPageBreak/>
-        <w:t>β measures the pass-through from productivity to firm-side real labour costs; γ measures the pass-through from productivity to workers’ real purchasing power.</w:t>
-      </w:r>
-    </w:p>
-    <w:p>
-      <w:pPr>
-        <w:spacing w:after="0"/>
-        <w:rPr>
-          <w:rFonts w:ascii="Calibri" w:hAnsi="Calibri" w:cs="Calibri"/>
-        </w:rPr>
-      </w:pPr>
-      <w:r>
-        <w:rPr>
-          <w:rFonts w:ascii="Calibri" w:hAnsi="Calibri" w:cs="Calibri"/>
-        </w:rPr>
-        <w:t>If you want a labour-share-augmented specification that mirrors the theoretical identity, you can also estimate descriptive decompositions such as:</w:t>
-      </w:r>
-    </w:p>
-    <w:p>
-      <w:pPr>
-        <w:spacing w:after="0"/>
-        <w:rPr>
-          <w:rFonts w:ascii="Calibri" w:hAnsi="Calibri" w:cs="Calibri"/>
-        </w:rPr>
-      </w:pPr>
-      <w:r>
-        <w:rPr>
-          <w:rFonts w:ascii="Calibri" w:hAnsi="Calibri" w:cs="Calibri"/>
-        </w:rPr>
         <w:t>Δln(w_real,output) ≈ Δln(prod) + Δln(LS)</w:t>
       </w:r>
     </w:p>
@@ -3129,7 +3141,6 @@
         <w:rPr>
           <w:rFonts w:ascii="Calibri" w:hAnsi="Calibri" w:cs="Calibri"/>
         </w:rPr>
-        <w:lastRenderedPageBreak/>
         <w:t>Focus the narrative on Italy and benchmark OECD countries.</w:t>
       </w:r>
     </w:p>
@@ -3176,6 +3187,7 @@
           <w:rFonts w:ascii="Calibri" w:hAnsi="Calibri" w:cs="Calibri"/>
           <w:sz w:val="28"/>
         </w:rPr>
+        <w:lastRenderedPageBreak/>
         <w:t>9. Data processing and coding pipeline</w:t>
       </w:r>
     </w:p>
@@ -3553,12 +3565,6 @@
           <w:rFonts w:ascii="Calibri" w:hAnsi="Calibri" w:cs="Calibri"/>
         </w:rPr>
         <w:br/>
-      </w:r>
-      <w:r>
-        <w:rPr>
-          <w:rFonts w:ascii="Calibri" w:hAnsi="Calibri" w:cs="Calibri"/>
-        </w:rPr>
-        <w:lastRenderedPageBreak/>
         <w:t>worker_ts["w_real"] = worker_ts["wage_real_ppp"]</w:t>
       </w:r>
       <w:r>
@@ -3591,6 +3597,7 @@
         <w:rPr>
           <w:rFonts w:ascii="Calibri" w:hAnsi="Calibri" w:cs="Calibri"/>
         </w:rPr>
+        <w:lastRenderedPageBreak/>
         <w:br/>
         <w:t>10.4 Index</w:t>
       </w:r>
@@ -4023,43 +4030,43 @@
         <w:rPr>
           <w:rFonts w:ascii="Calibri" w:hAnsi="Calibri" w:cs="Calibri"/>
         </w:rPr>
+        <w:t>Panel = multiple countries over time</w:t>
+      </w:r>
+    </w:p>
+    <w:p>
+      <w:pPr>
+        <w:spacing w:after="0" w:line="240" w:lineRule="auto"/>
+        <w:rPr>
+          <w:rFonts w:ascii="Calibri" w:hAnsi="Calibri" w:cs="Calibri"/>
+        </w:rPr>
+      </w:pPr>
+    </w:p>
+    <w:p>
+      <w:pPr>
+        <w:spacing w:after="0" w:line="240" w:lineRule="auto"/>
+        <w:rPr>
+          <w:rFonts w:ascii="Calibri" w:hAnsi="Calibri" w:cs="Calibri"/>
+        </w:rPr>
+      </w:pPr>
+      <w:r>
+        <w:rPr>
+          <w:rFonts w:ascii="Calibri" w:hAnsi="Calibri" w:cs="Calibri"/>
+        </w:rPr>
+        <w:t>Model:</w:t>
+      </w:r>
+    </w:p>
+    <w:p>
+      <w:pPr>
+        <w:spacing w:after="0" w:line="240" w:lineRule="auto"/>
+        <w:rPr>
+          <w:rFonts w:ascii="Calibri" w:hAnsi="Calibri" w:cs="Calibri"/>
+        </w:rPr>
+      </w:pPr>
+      <w:r>
+        <w:rPr>
+          <w:rFonts w:ascii="Calibri" w:hAnsi="Calibri" w:cs="Calibri"/>
+        </w:rPr>
         <w:lastRenderedPageBreak/>
-        <w:t>Panel = multiple countries over time</w:t>
-      </w:r>
-    </w:p>
-    <w:p>
-      <w:pPr>
-        <w:spacing w:after="0" w:line="240" w:lineRule="auto"/>
-        <w:rPr>
-          <w:rFonts w:ascii="Calibri" w:hAnsi="Calibri" w:cs="Calibri"/>
-        </w:rPr>
-      </w:pPr>
-    </w:p>
-    <w:p>
-      <w:pPr>
-        <w:spacing w:after="0" w:line="240" w:lineRule="auto"/>
-        <w:rPr>
-          <w:rFonts w:ascii="Calibri" w:hAnsi="Calibri" w:cs="Calibri"/>
-        </w:rPr>
-      </w:pPr>
-      <w:r>
-        <w:rPr>
-          <w:rFonts w:ascii="Calibri" w:hAnsi="Calibri" w:cs="Calibri"/>
-        </w:rPr>
-        <w:t>Model:</w:t>
-      </w:r>
-    </w:p>
-    <w:p>
-      <w:pPr>
-        <w:spacing w:after="0" w:line="240" w:lineRule="auto"/>
-        <w:rPr>
-          <w:rFonts w:ascii="Calibri" w:hAnsi="Calibri" w:cs="Calibri"/>
-        </w:rPr>
-      </w:pPr>
-      <w:r>
-        <w:rPr>
-          <w:rFonts w:ascii="Calibri" w:hAnsi="Calibri" w:cs="Calibri"/>
-        </w:rPr>
         <w:t>Δln(w_it) = α_i + λ_t + β Δln(prod_it) + ε_it</w:t>
       </w:r>
       <w:r>

</xml_diff>

<commit_message>
productivity-wages project - Methodology and README modification
</commit_message>
<xml_diff>
--- a/productivity_labourcompensation_distribution/docs/methodology/Productivity_LabourComp_LabourShare_ULC_Project_Methodology.docx
+++ b/productivity_labourcompensation_distribution/docs/methodology/Productivity_LabourComp_LabourShare_ULC_Project_Methodology.docx
@@ -116,81 +116,73 @@
         <w:rPr>
           <w:rFonts w:ascii="Calibri" w:hAnsi="Calibri" w:cs="Calibri"/>
         </w:rPr>
-        <w:t>This document develops a coherent empirical framework to analyse the relationship between productivity, labour compensation, real wages, labour shares, and unit labour costs in G7 economies. The project is organised around two main perspectives: a firm-side module centred on real product wages (i.e. labour compensation adjusted for self-employment) and unit labour costs; a worker-side module centred on real consumption wages. The main objective is to quantify the pass-through from productivity to wages under these two perspectives.</w:t>
-      </w:r>
-    </w:p>
-    <w:p>
-      <w:pPr>
-        <w:spacing w:after="0"/>
-        <w:rPr>
-          <w:rFonts w:ascii="Calibri" w:hAnsi="Calibri" w:cs="Calibri"/>
-        </w:rPr>
-      </w:pPr>
-      <w:r>
-        <w:rPr>
-          <w:rFonts w:ascii="Calibri" w:hAnsi="Calibri" w:cs="Calibri"/>
-        </w:rPr>
-        <w:t>Core sample: G7 economies.</w:t>
-      </w:r>
-    </w:p>
-    <w:p>
-      <w:pPr>
-        <w:pStyle w:val="ListBullet"/>
-        <w:spacing w:after="0"/>
-        <w:rPr>
-          <w:rFonts w:ascii="Calibri" w:hAnsi="Calibri" w:cs="Calibri"/>
-        </w:rPr>
-      </w:pPr>
-      <w:r>
-        <w:rPr>
-          <w:rFonts w:ascii="Calibri" w:hAnsi="Calibri" w:cs="Calibri"/>
-        </w:rPr>
-        <w:t>Main perspective: time-series analysis, with cross-country snapshots used as supporting evidence.</w:t>
-      </w:r>
-    </w:p>
-    <w:p>
-      <w:pPr>
-        <w:pStyle w:val="ListBullet"/>
-        <w:spacing w:after="0"/>
-        <w:rPr>
-          <w:rFonts w:ascii="Calibri" w:hAnsi="Calibri" w:cs="Calibri"/>
-        </w:rPr>
-      </w:pPr>
-      <w:r>
-        <w:rPr>
-          <w:rFonts w:ascii="Calibri" w:hAnsi="Calibri" w:cs="Calibri"/>
-        </w:rPr>
-        <w:t>Backbone database: OECD Productivity Database and related OECD wage series.</w:t>
-      </w:r>
-    </w:p>
-    <w:p>
-      <w:pPr>
-        <w:pStyle w:val="ListBullet"/>
-        <w:spacing w:after="0"/>
-        <w:rPr>
-          <w:rFonts w:ascii="Calibri" w:hAnsi="Calibri" w:cs="Calibri"/>
-        </w:rPr>
-      </w:pPr>
-      <w:r>
-        <w:rPr>
-          <w:rFonts w:ascii="Calibri" w:hAnsi="Calibri" w:cs="Calibri"/>
-        </w:rPr>
-        <w:t>Robustness layers: AMECO adjusted wage share; OECD real wages on a consumption-price basis;</w:t>
-      </w:r>
-    </w:p>
-    <w:p>
-      <w:pPr>
-        <w:pStyle w:val="ListBullet"/>
-        <w:spacing w:after="0"/>
-        <w:rPr>
-          <w:rFonts w:ascii="Calibri" w:hAnsi="Calibri" w:cs="Calibri"/>
-        </w:rPr>
-      </w:pPr>
-      <w:r>
-        <w:rPr>
-          <w:rFonts w:ascii="Calibri" w:hAnsi="Calibri" w:cs="Calibri"/>
-        </w:rPr>
-        <w:t>Capital deepening and TFP remain relevant as background determinants of labour productivity and connect naturally to the separate CES project, but they are not the central explanatory objects in the baseline pass-through analysis. The main question here is narrower and more concrete: when labour productivity changes, how much of that change is transmitted to labour compensation on the firm side, and how much of it reaches workers’ purchasing power on the household side?</w:t>
+        <w:t>This document develops a coherent empirical framework to analyse the relationship between productivity, labour compensation, real wages, labour shares, and unit labour costs in G7 economies. The project is organised around two main perspectives: a firm-side module centred on real product wages (i.e. labour compensation expressed in output-price terms) and unit labour costs, and a worker-side module centred on real consumption wages.</w:t>
+      </w:r>
+    </w:p>
+    <w:p>
+      <w:pPr>
+        <w:spacing w:after="0"/>
+        <w:rPr>
+          <w:rFonts w:ascii="Calibri" w:hAnsi="Calibri" w:cs="Calibri"/>
+        </w:rPr>
+      </w:pPr>
+    </w:p>
+    <w:p>
+      <w:pPr>
+        <w:spacing w:after="0"/>
+        <w:rPr>
+          <w:rFonts w:ascii="Calibri" w:hAnsi="Calibri" w:cs="Calibri"/>
+        </w:rPr>
+      </w:pPr>
+      <w:r>
+        <w:rPr>
+          <w:rFonts w:ascii="Calibri" w:hAnsi="Calibri" w:cs="Calibri"/>
+        </w:rPr>
+        <w:t>The main objective is to quantify the pass-through from productivity to wages under these two perspectives. The empirical focus is deliberately narrow and concrete: when labour productivity changes, how much of that change is transmitted to labour compensation on the firm side, and how much of it reaches workers’ purchasing power on the household side.</w:t>
+      </w:r>
+    </w:p>
+    <w:p>
+      <w:pPr>
+        <w:spacing w:after="0"/>
+        <w:rPr>
+          <w:rFonts w:ascii="Calibri" w:hAnsi="Calibri" w:cs="Calibri"/>
+        </w:rPr>
+      </w:pPr>
+    </w:p>
+    <w:p>
+      <w:pPr>
+        <w:spacing w:after="0"/>
+        <w:rPr>
+          <w:rFonts w:ascii="Calibri" w:hAnsi="Calibri" w:cs="Calibri"/>
+        </w:rPr>
+      </w:pPr>
+      <w:r>
+        <w:rPr>
+          <w:rFonts w:ascii="Calibri" w:hAnsi="Calibri" w:cs="Calibri"/>
+        </w:rPr>
+        <w:t>The core sample consists of G7 economies. The analysis is primarily time-series based, while cross-country comparisons are used as supporting descriptive evidence. The backbone dataset is the OECD Productivity Database combined with OECD wage series. Robustness layers include AMECO adjusted wage shares and alternative real wage measures expressed in consumption prices.</w:t>
+      </w:r>
+    </w:p>
+    <w:p>
+      <w:pPr>
+        <w:spacing w:after="0"/>
+        <w:rPr>
+          <w:rFonts w:ascii="Calibri" w:hAnsi="Calibri" w:cs="Calibri"/>
+        </w:rPr>
+      </w:pPr>
+    </w:p>
+    <w:p>
+      <w:pPr>
+        <w:spacing w:after="0"/>
+        <w:rPr>
+          <w:rFonts w:ascii="Calibri" w:hAnsi="Calibri" w:cs="Calibri"/>
+        </w:rPr>
+      </w:pPr>
+      <w:r>
+        <w:rPr>
+          <w:rFonts w:ascii="Calibri" w:hAnsi="Calibri" w:cs="Calibri"/>
+        </w:rPr>
+        <w:t>Capital deepening and total factor productivity remain relevant as background determinants of labour productivity and connect naturally to the separate CES project, but they are not the central explanatory objects in the baseline pass-through analysis.</w:t>
       </w:r>
     </w:p>
     <w:p>
@@ -276,7 +268,7 @@
         <w:rPr>
           <w:rFonts w:ascii="Calibri" w:hAnsi="Calibri" w:cs="Calibri"/>
         </w:rPr>
-        <w:t>Here Y is real output or real value added, A is a scale/productivity term, K is capital input, L is labour input, α is the elasticity of output with respect to capital, and 1−α is the elasticity of output with respect to labour. The Cobb–Douglas case is the cleanest benchmark because it delivers constant factor shares under strong but transparent assumptions.</w:t>
+        <w:t>where Y is output, A is productivity, K is capital input, L is labour input, and α is the capital elasticity.</w:t>
       </w:r>
     </w:p>
     <w:p>
@@ -1679,20 +1671,20 @@
           <w:rFonts w:ascii="Calibri" w:hAnsi="Calibri" w:cs="Calibri"/>
         </w:rPr>
       </w:pPr>
-    </w:p>
-    <w:p>
-      <w:pPr>
-        <w:spacing w:after="0"/>
-        <w:rPr>
-          <w:rFonts w:ascii="Calibri" w:hAnsi="Calibri" w:cs="Calibri"/>
-        </w:rPr>
-      </w:pPr>
       <w:r>
         <w:rPr>
           <w:rFonts w:ascii="Calibri" w:hAnsi="Calibri" w:cs="Calibri"/>
         </w:rPr>
         <w:t>This dual specification allows for robustness checks across different definitions of labour input.</w:t>
       </w:r>
+    </w:p>
+    <w:p>
+      <w:pPr>
+        <w:spacing w:after="0"/>
+        <w:rPr>
+          <w:rFonts w:ascii="Calibri" w:hAnsi="Calibri" w:cs="Calibri"/>
+        </w:rPr>
+      </w:pPr>
     </w:p>
     <w:p>
       <w:pPr>
@@ -1807,14 +1799,6 @@
           <w:rFonts w:ascii="Calibri" w:hAnsi="Calibri" w:cs="Calibri"/>
         </w:rPr>
       </w:pPr>
-    </w:p>
-    <w:p>
-      <w:pPr>
-        <w:spacing w:after="0"/>
-        <w:rPr>
-          <w:rFonts w:ascii="Calibri" w:hAnsi="Calibri" w:cs="Calibri"/>
-        </w:rPr>
-      </w:pPr>
       <w:r>
         <w:rPr>
           <w:rFonts w:ascii="Calibri" w:hAnsi="Calibri" w:cs="Calibri"/>
@@ -1841,52 +1825,20 @@
         <w:rPr>
           <w:rFonts w:ascii="Calibri" w:hAnsi="Calibri" w:cs="Calibri"/>
         </w:rPr>
-        <w:t>From a theoretical perspective, the gap is related to labour share:</w:t>
-      </w:r>
-    </w:p>
-    <w:p>
-      <w:pPr>
-        <w:spacing w:after="0"/>
-        <w:rPr>
-          <w:rFonts w:ascii="Calibri" w:hAnsi="Calibri" w:cs="Calibri"/>
-        </w:rPr>
-      </w:pPr>
-      <w:r>
-        <w:rPr>
-          <w:rFonts w:ascii="Calibri" w:hAnsi="Calibri" w:cs="Calibri"/>
-        </w:rPr>
-        <w:t>gap ≈ − ln(labour share)</w:t>
-      </w:r>
-    </w:p>
-    <w:p>
-      <w:pPr>
-        <w:spacing w:after="0"/>
-        <w:rPr>
-          <w:rFonts w:ascii="Calibri" w:hAnsi="Calibri" w:cs="Calibri"/>
-        </w:rPr>
-      </w:pPr>
-    </w:p>
-    <w:p>
-      <w:pPr>
-        <w:spacing w:after="0"/>
-        <w:rPr>
-          <w:rFonts w:ascii="Calibri" w:hAnsi="Calibri" w:cs="Calibri"/>
-        </w:rPr>
-      </w:pPr>
-      <w:r>
-        <w:rPr>
-          <w:rFonts w:ascii="Calibri" w:hAnsi="Calibri" w:cs="Calibri"/>
-        </w:rPr>
-        <w:t>However, in empirical implementation this relationship is only approximate due to:</w:t>
-      </w:r>
-    </w:p>
-    <w:p>
-      <w:pPr>
-        <w:spacing w:after="0"/>
-        <w:rPr>
-          <w:rFonts w:ascii="Calibri" w:hAnsi="Calibri" w:cs="Calibri"/>
-        </w:rPr>
-      </w:pPr>
+        <w:t>From a theoretical perspective, the gap is related to labour share (gap ≈ − ln(labour share)), but in empirical implementation this relationship is only approximate</w:t>
+      </w:r>
+      <w:r>
+        <w:rPr>
+          <w:rFonts w:ascii="Calibri" w:hAnsi="Calibri" w:cs="Calibri"/>
+        </w:rPr>
+        <w:t xml:space="preserve"> </w:t>
+      </w:r>
+      <w:r>
+        <w:rPr>
+          <w:rFonts w:ascii="Calibri" w:hAnsi="Calibri" w:cs="Calibri"/>
+        </w:rPr>
+        <w:t>due to:</w:t>
+      </w:r>
     </w:p>
     <w:p>
       <w:pPr>
@@ -2024,6 +1976,20 @@
           <w:rFonts w:ascii="Calibri" w:hAnsi="Calibri" w:cs="Calibri"/>
         </w:rPr>
         <w:t>β measures pass-through from productivity to firm-side real wages.</w:t>
+      </w:r>
+    </w:p>
+    <w:p>
+      <w:pPr>
+        <w:spacing w:after="0"/>
+        <w:rPr>
+          <w:rFonts w:ascii="Calibri" w:hAnsi="Calibri" w:cs="Calibri"/>
+        </w:rPr>
+      </w:pPr>
+      <w:r>
+        <w:rPr>
+          <w:rFonts w:ascii="Calibri" w:hAnsi="Calibri" w:cs="Calibri"/>
+        </w:rPr>
+        <w:t>Country and time fixed effects are included. Standard errors are clustered at the country level.</w:t>
       </w:r>
     </w:p>
     <w:p>
@@ -2160,21 +2126,21 @@
         <w:rPr>
           <w:rFonts w:ascii="Calibri" w:hAnsi="Calibri" w:cs="Calibri"/>
         </w:rPr>
-        <w:t>Δln(ULC) = f(productivity)</w:t>
-      </w:r>
-    </w:p>
-    <w:p>
-      <w:pPr>
-        <w:spacing w:after="0"/>
-        <w:rPr>
-          <w:rFonts w:ascii="Calibri" w:hAnsi="Calibri" w:cs="Calibri"/>
-        </w:rPr>
-      </w:pPr>
-      <w:r>
-        <w:rPr>
-          <w:rFonts w:ascii="Calibri" w:hAnsi="Calibri" w:cs="Calibri"/>
-        </w:rPr>
-        <w:t>Used only as a robustness and consistency check.</w:t>
+        <w:t>Δln(ULC) = α_i + λ_t + β·Δln(productivity) + ε</w:t>
+      </w:r>
+    </w:p>
+    <w:p>
+      <w:pPr>
+        <w:spacing w:after="0"/>
+        <w:rPr>
+          <w:rFonts w:ascii="Calibri" w:hAnsi="Calibri" w:cs="Calibri"/>
+        </w:rPr>
+      </w:pPr>
+      <w:r>
+        <w:rPr>
+          <w:rFonts w:ascii="Calibri" w:hAnsi="Calibri" w:cs="Calibri"/>
+        </w:rPr>
+        <w:t>This specification is used only as a robustness and consistency check.</w:t>
       </w:r>
     </w:p>
     <w:p>
@@ -2277,7 +2243,6 @@
           <w:sz w:val="25"/>
           <w:szCs w:val="26"/>
         </w:rPr>
-        <w:lastRenderedPageBreak/>
         <w:t>4</w:t>
       </w:r>
       <w:r>
@@ -2331,6 +2296,7 @@
         <w:rPr>
           <w:rFonts w:ascii="Calibri" w:hAnsi="Calibri" w:cs="Calibri"/>
         </w:rPr>
+        <w:lastRenderedPageBreak/>
         <w:t>These results are purely descriptive due to small sample size.</w:t>
       </w:r>
     </w:p>
@@ -2832,7 +2798,6 @@
           <w:rFonts w:ascii="Calibri" w:hAnsi="Calibri" w:cs="Calibri"/>
           <w:szCs w:val="21"/>
         </w:rPr>
-        <w:lastRenderedPageBreak/>
         <w:t>This step produces:</w:t>
       </w:r>
     </w:p>
@@ -2896,6 +2861,7 @@
           <w:rFonts w:ascii="Calibri" w:hAnsi="Calibri" w:cs="Calibri"/>
           <w:szCs w:val="21"/>
         </w:rPr>
+        <w:lastRenderedPageBreak/>
         <w:t xml:space="preserve">output-price inflation  </w:t>
       </w:r>
     </w:p>
@@ -3455,7 +3421,6 @@
         <w:rPr>
           <w:rFonts w:ascii="Calibri" w:hAnsi="Calibri" w:cs="Calibri"/>
         </w:rPr>
-        <w:lastRenderedPageBreak/>
         <w:t>This index captures purchasing power and is compared with productivity to assess worker-side pass-through.</w:t>
       </w:r>
     </w:p>
@@ -3483,6 +3448,7 @@
           <w:sz w:val="23"/>
           <w:szCs w:val="23"/>
         </w:rPr>
+        <w:lastRenderedPageBreak/>
         <w:t>6.6 Step 5: build labour shares and compensation breakdowns</w:t>
       </w:r>
     </w:p>
@@ -3840,7 +3806,7 @@
         <w:rPr>
           <w:rFonts w:ascii="Calibri" w:hAnsi="Calibri" w:cs="Calibri"/>
         </w:rPr>
-        <w:t>Therefore, the gap is interpreted as a descriptive indicator rather than an exact identity.</w:t>
+        <w:t>Therefore, the gap is interpreted as a descriptive indicator of divergence rather than as an exact accounting identity.</w:t>
       </w:r>
     </w:p>
     <w:p>
@@ -4040,7 +4006,6 @@
         <w:rPr>
           <w:rFonts w:ascii="Calibri" w:hAnsi="Calibri" w:cs="Calibri"/>
         </w:rPr>
-        <w:lastRenderedPageBreak/>
         <w:t>These visuals provide the primary descriptive evidence for pass-through dynamics.</w:t>
       </w:r>
     </w:p>
@@ -4074,6 +4039,7 @@
           <w:sz w:val="23"/>
           <w:szCs w:val="23"/>
         </w:rPr>
+        <w:lastRenderedPageBreak/>
         <w:t>6.9 Step 8: pass-through regressions</w:t>
       </w:r>
     </w:p>
@@ -4606,7 +4572,13 @@
         <w:rPr>
           <w:rFonts w:ascii="Calibri" w:hAnsi="Calibri" w:cs="Calibri"/>
         </w:rPr>
-        <w:t xml:space="preserve">Firm-side wages follow productivity but PPP wages lag  </w:t>
+        <w:t>Firm-side wages follow productivity but PPP wages lag</w:t>
+      </w:r>
+      <w:r>
+        <w:rPr>
+          <w:rFonts w:ascii="Calibri" w:hAnsi="Calibri" w:cs="Calibri"/>
+        </w:rPr>
+        <w:t>.</w:t>
       </w:r>
     </w:p>
     <w:p>
@@ -4617,22 +4589,27 @@
           <w:numId w:val="0"/>
         </w:numPr>
         <w:spacing w:after="0"/>
-        <w:ind w:left="360" w:hanging="360"/>
-        <w:rPr>
-          <w:rFonts w:ascii="Calibri" w:hAnsi="Calibri" w:cs="Calibri"/>
-        </w:rPr>
-      </w:pPr>
-      <w:r>
-        <w:rPr>
-          <w:rFonts w:ascii="Calibri" w:hAnsi="Calibri" w:cs="Calibri" w:hint="eastAsia"/>
-        </w:rPr>
-        <w:t>→</w:t>
-      </w:r>
-      <w:r>
-        <w:rPr>
-          <w:rFonts w:ascii="Calibri" w:hAnsi="Calibri" w:cs="Calibri" w:hint="eastAsia"/>
-        </w:rPr>
-        <w:t xml:space="preserve"> reflects price wedges and distribution effects  </w:t>
+        <w:rPr>
+          <w:rFonts w:ascii="Calibri" w:hAnsi="Calibri" w:cs="Calibri"/>
+        </w:rPr>
+      </w:pPr>
+      <w:r>
+        <w:rPr>
+          <w:rFonts w:ascii="Calibri" w:hAnsi="Calibri" w:cs="Calibri"/>
+        </w:rPr>
+        <w:t>The divergence between firm-side and worker-side results reflects the wedge between output prices and consumer</w:t>
+      </w:r>
+      <w:r>
+        <w:rPr>
+          <w:rFonts w:ascii="Calibri" w:hAnsi="Calibri" w:cs="Calibri"/>
+        </w:rPr>
+        <w:t xml:space="preserve"> </w:t>
+      </w:r>
+      <w:r>
+        <w:rPr>
+          <w:rFonts w:ascii="Calibri" w:hAnsi="Calibri" w:cs="Calibri"/>
+        </w:rPr>
+        <w:t>prices, as well as institutional and distributional factors.</w:t>
       </w:r>
     </w:p>
     <w:p>
@@ -4643,7 +4620,6 @@
           <w:numId w:val="0"/>
         </w:numPr>
         <w:spacing w:after="0"/>
-        <w:ind w:left="360"/>
         <w:rPr>
           <w:rFonts w:ascii="Calibri" w:hAnsi="Calibri" w:cs="Calibri"/>
         </w:rPr>
@@ -4708,22 +4684,22 @@
         <w:rPr>
           <w:rFonts w:ascii="Calibri" w:hAnsi="Calibri" w:cs="Calibri"/>
         </w:rPr>
+        <w:t>Reference-year differences: constant PPP 2020 versus 2021 is not a problem once indices are rebased.</w:t>
+      </w:r>
+    </w:p>
+    <w:p>
+      <w:pPr>
+        <w:pStyle w:val="ListBullet"/>
+        <w:spacing w:after="0"/>
+        <w:rPr>
+          <w:rFonts w:ascii="Calibri" w:hAnsi="Calibri" w:cs="Calibri"/>
+        </w:rPr>
+      </w:pPr>
+      <w:r>
+        <w:rPr>
+          <w:rFonts w:ascii="Calibri" w:hAnsi="Calibri" w:cs="Calibri"/>
+        </w:rPr>
         <w:lastRenderedPageBreak/>
-        <w:t>Reference-year differences: constant PPP 2020 versus 2021 is not a problem once indices are rebased.</w:t>
-      </w:r>
-    </w:p>
-    <w:p>
-      <w:pPr>
-        <w:pStyle w:val="ListBullet"/>
-        <w:spacing w:after="0"/>
-        <w:rPr>
-          <w:rFonts w:ascii="Calibri" w:hAnsi="Calibri" w:cs="Calibri"/>
-        </w:rPr>
-      </w:pPr>
-      <w:r>
-        <w:rPr>
-          <w:rFonts w:ascii="Calibri" w:hAnsi="Calibri" w:cs="Calibri"/>
-        </w:rPr>
         <w:t>ULC is not labour share: ULC measures nominal labour cost per unit of real output, whereas labour share measures labour cost as a fraction of nominal value added.</w:t>
       </w:r>
     </w:p>

</xml_diff>